<commit_message>
Deployed cc8f4f93 with MkDocs version: 1.6.1
</commit_message>
<xml_diff>
--- a/AI is a Bulldozer .docx
+++ b/AI is a Bulldozer .docx
@@ -2,7 +2,71 @@
 <file path=word/document.xml><?xml version="1.0" encoding="utf-8"?>
 <w:document xmlns:wpc="http://schemas.microsoft.com/office/word/2010/wordprocessingCanvas" xmlns:cx="http://schemas.microsoft.com/office/drawing/2014/chartex" xmlns:cx1="http://schemas.microsoft.com/office/drawing/2015/9/8/chartex" xmlns:cx2="http://schemas.microsoft.com/office/drawing/2015/10/21/chartex" xmlns:cx3="http://schemas.microsoft.com/office/drawing/2016/5/9/chartex" xmlns:cx4="http://schemas.microsoft.com/office/drawing/2016/5/10/chartex" xmlns:cx5="http://schemas.microsoft.com/office/drawing/2016/5/11/chartex" xmlns:cx6="http://schemas.microsoft.com/office/drawing/2016/5/12/chartex" xmlns:cx7="http://schemas.microsoft.com/office/drawing/2016/5/13/chartex" xmlns:cx8="http://schemas.microsoft.com/office/drawing/2016/5/14/chartex" xmlns:mc="http://schemas.openxmlformats.org/markup-compatibility/2006" xmlns:aink="http://schemas.microsoft.com/office/drawing/2016/ink" xmlns:am3d="http://schemas.microsoft.com/office/drawing/2017/model3d" xmlns:o="urn:schemas-microsoft-com:office:office" xmlns:oel="http://schemas.microsoft.com/office/2019/extlst" xmlns:r="http://schemas.openxmlformats.org/officeDocument/2006/relationships" xmlns:m="http://schemas.openxmlformats.org/officeDocument/2006/math" xmlns:v="urn:schemas-microsoft-com:vml" xmlns:wp14="http://schemas.microsoft.com/office/word/2010/wordprocessingDrawing" xmlns:wp="http://schemas.openxmlformats.org/drawingml/2006/wordprocessingDrawing" xmlns:w10="urn:schemas-microsoft-com:office:word" xmlns:w="http://schemas.openxmlformats.org/wordprocessingml/2006/main" xmlns:w14="http://schemas.microsoft.com/office/word/2010/wordml" xmlns:w15="http://schemas.microsoft.com/office/word/2012/wordml" xmlns:w16cex="http://schemas.microsoft.com/office/word/2018/wordml/cex" xmlns:w16cid="http://schemas.microsoft.com/office/word/2016/wordml/cid" xmlns:w16="http://schemas.microsoft.com/office/word/2018/wordml" xmlns:w16du="http://schemas.microsoft.com/office/word/2023/wordml/word16du" xmlns:w16sdtdh="http://schemas.microsoft.com/office/word/2020/wordml/sdtdatahash" xmlns:w16sdtfl="http://schemas.microsoft.com/office/word/2024/wordml/sdtformatlock" xmlns:w16se="http://schemas.microsoft.com/office/word/2015/wordml/symex" xmlns:wpg="http://schemas.microsoft.com/office/word/2010/wordprocessingGroup" xmlns:wpi="http://schemas.microsoft.com/office/word/2010/wordprocessingInk" xmlns:wne="http://schemas.microsoft.com/office/word/2006/wordml" xmlns:wps="http://schemas.microsoft.com/office/word/2010/wordprocessingShape" mc:Ignorable="w14 w15 w16se w16cid w16 w16cex w16sdtdh w16sdtfl w16du wp14">
   <w:body>
-    <w:p/>
+    <w:p>
+      <w:pPr>
+        <w:rPr>
+          <w:rFonts w:ascii="Times New Roman" w:hAnsi="Times New Roman" w:cs="Times New Roman"/>
+          <w:i/>
+          <w:iCs/>
+          <w:sz w:val="22"/>
+          <w:szCs w:val="22"/>
+        </w:rPr>
+      </w:pPr>
+      <w:r>
+        <w:rPr>
+          <w:rFonts w:ascii="Times New Roman" w:hAnsi="Times New Roman" w:cs="Times New Roman"/>
+          <w:i/>
+          <w:iCs/>
+          <w:sz w:val="22"/>
+          <w:szCs w:val="22"/>
+        </w:rPr>
+        <w:t xml:space="preserve"> Technology is often reduced to initials, like IT, AI and LLM; metaphors: Data Warehouses, Data Lakes, the Cloud, etc.; and occasionally oxymorons, notably Artificial Intelligence.  ‘Artificial Intelligence’ suggests that AI is fake and therefore untrustworthy.  I offer another </w:t>
+      </w:r>
+      <w:proofErr w:type="gramStart"/>
+      <w:r>
+        <w:rPr>
+          <w:rFonts w:ascii="Times New Roman" w:hAnsi="Times New Roman" w:cs="Times New Roman"/>
+          <w:i/>
+          <w:iCs/>
+          <w:sz w:val="22"/>
+          <w:szCs w:val="22"/>
+        </w:rPr>
+        <w:t>Metaphor,  ‘</w:t>
+      </w:r>
+      <w:proofErr w:type="gramEnd"/>
+      <w:r>
+        <w:rPr>
+          <w:rFonts w:ascii="Times New Roman" w:hAnsi="Times New Roman" w:cs="Times New Roman"/>
+          <w:i/>
+          <w:iCs/>
+          <w:sz w:val="22"/>
+          <w:szCs w:val="22"/>
+        </w:rPr>
+        <w:t xml:space="preserve">Data Bulldozer’ to describe a powerful </w:t>
+      </w:r>
+      <w:proofErr w:type="gramStart"/>
+      <w:r>
+        <w:rPr>
+          <w:rFonts w:ascii="Times New Roman" w:hAnsi="Times New Roman" w:cs="Times New Roman"/>
+          <w:i/>
+          <w:iCs/>
+          <w:sz w:val="22"/>
+          <w:szCs w:val="22"/>
+        </w:rPr>
+        <w:t>technology .</w:t>
+      </w:r>
+      <w:proofErr w:type="gramEnd"/>
+      <w:r>
+        <w:rPr>
+          <w:rFonts w:ascii="Times New Roman" w:hAnsi="Times New Roman" w:cs="Times New Roman"/>
+          <w:i/>
+          <w:iCs/>
+          <w:sz w:val="22"/>
+          <w:szCs w:val="22"/>
+        </w:rPr>
+        <w:t xml:space="preserve">   </w:t>
+      </w:r>
+    </w:p>
     <w:p>
       <w:pPr>
         <w:jc w:val="center"/>
@@ -13,15 +77,17 @@
           <w:szCs w:val="36"/>
         </w:rPr>
       </w:pPr>
-      <w:r>
+    </w:p>
+    <w:p>
+      <w:pPr>
+        <w:jc w:val="center"/>
         <w:rPr>
           <w:b/>
           <w:bCs/>
           <w:sz w:val="36"/>
           <w:szCs w:val="36"/>
         </w:rPr>
-        <w:t xml:space="preserve">AI is </w:t>
-      </w:r>
+      </w:pPr>
       <w:r>
         <w:rPr>
           <w:b/>
@@ -29,7 +95,7 @@
           <w:sz w:val="36"/>
           <w:szCs w:val="36"/>
         </w:rPr>
-        <w:t xml:space="preserve">a </w:t>
+        <w:t xml:space="preserve">AI is </w:t>
       </w:r>
       <w:r>
         <w:rPr>
@@ -38,7 +104,34 @@
           <w:sz w:val="36"/>
           <w:szCs w:val="36"/>
         </w:rPr>
-        <w:t>Bulldozer for Moving Data</w:t>
+        <w:t xml:space="preserve">a </w:t>
+      </w:r>
+      <w:r>
+        <w:rPr>
+          <w:b/>
+          <w:bCs/>
+          <w:sz w:val="36"/>
+          <w:szCs w:val="36"/>
+        </w:rPr>
+        <w:t>Bulldozer for Moving</w:t>
+      </w:r>
+      <w:r>
+        <w:rPr>
+          <w:b/>
+          <w:bCs/>
+          <w:sz w:val="36"/>
+          <w:szCs w:val="36"/>
+        </w:rPr>
+        <w:t xml:space="preserve"> Mountains of </w:t>
+      </w:r>
+      <w:r>
+        <w:rPr>
+          <w:b/>
+          <w:bCs/>
+          <w:sz w:val="36"/>
+          <w:szCs w:val="36"/>
+        </w:rPr>
+        <w:t>Data</w:t>
       </w:r>
     </w:p>
     <w:p>
@@ -137,40 +230,62 @@
           <w:sz w:val="28"/>
           <w:szCs w:val="28"/>
         </w:rPr>
-        <w:t>Human Wisdom</w:t>
+        <w:t>Human</w:t>
       </w:r>
       <w:r>
         <w:rPr>
           <w:sz w:val="28"/>
           <w:szCs w:val="28"/>
         </w:rPr>
-        <w:t xml:space="preserve"> </w:t>
+        <w:t xml:space="preserve"> Wisdom</w:t>
       </w:r>
       <w:r>
         <w:rPr>
           <w:sz w:val="28"/>
           <w:szCs w:val="28"/>
         </w:rPr>
-        <w:t xml:space="preserve">to </w:t>
+        <w:t xml:space="preserve"> </w:t>
       </w:r>
       <w:r>
         <w:rPr>
           <w:sz w:val="28"/>
           <w:szCs w:val="28"/>
         </w:rPr>
-        <w:t>F</w:t>
+        <w:t xml:space="preserve">to </w:t>
       </w:r>
       <w:r>
         <w:rPr>
           <w:sz w:val="28"/>
           <w:szCs w:val="28"/>
         </w:rPr>
-        <w:t xml:space="preserve">lourish </w:t>
+        <w:t>F</w:t>
+      </w:r>
+      <w:r>
+        <w:rPr>
+          <w:sz w:val="28"/>
+          <w:szCs w:val="28"/>
+        </w:rPr>
+        <w:t>lourish</w:t>
+      </w:r>
+      <w:r>
+        <w:rPr>
+          <w:sz w:val="28"/>
+          <w:szCs w:val="28"/>
+        </w:rPr>
+        <w:t>.</w:t>
+      </w:r>
+      <w:r>
+        <w:rPr>
+          <w:sz w:val="28"/>
+          <w:szCs w:val="28"/>
+        </w:rPr>
+        <w:t xml:space="preserve"> </w:t>
       </w:r>
     </w:p>
     <w:p>
       <w:pPr>
         <w:pStyle w:val="font-claude-response-body"/>
+        <w:jc w:val="both"/>
         <w:rPr>
           <w:rFonts w:asciiTheme="minorHAnsi" w:hAnsiTheme="minorHAnsi"/>
           <w:sz w:val="22"/>
@@ -199,66 +314,139 @@
           <w:sz w:val="22"/>
           <w:szCs w:val="22"/>
         </w:rPr>
-        <w:t>in these moments we must rely on wisdom to make decisions.</w:t>
+        <w:t>in these moments we rely on</w:t>
+      </w:r>
+      <w:r>
+        <w:rPr>
+          <w:rFonts w:asciiTheme="minorHAnsi" w:hAnsiTheme="minorHAnsi"/>
+          <w:sz w:val="22"/>
+          <w:szCs w:val="22"/>
+        </w:rPr>
+        <w:t xml:space="preserve"> </w:t>
+      </w:r>
+      <w:proofErr w:type="gramStart"/>
+      <w:r>
+        <w:rPr>
+          <w:rFonts w:asciiTheme="minorHAnsi" w:hAnsiTheme="minorHAnsi"/>
+          <w:sz w:val="22"/>
+          <w:szCs w:val="22"/>
+        </w:rPr>
+        <w:t xml:space="preserve">personal </w:t>
+      </w:r>
+      <w:r>
+        <w:rPr>
+          <w:rFonts w:asciiTheme="minorHAnsi" w:hAnsiTheme="minorHAnsi"/>
+          <w:sz w:val="22"/>
+          <w:szCs w:val="22"/>
+        </w:rPr>
+        <w:t xml:space="preserve"> wisdom</w:t>
+      </w:r>
+      <w:proofErr w:type="gramEnd"/>
+      <w:r>
+        <w:rPr>
+          <w:rFonts w:asciiTheme="minorHAnsi" w:hAnsiTheme="minorHAnsi"/>
+          <w:sz w:val="22"/>
+          <w:szCs w:val="22"/>
+        </w:rPr>
+        <w:t xml:space="preserve"> to make decisions.</w:t>
       </w:r>
     </w:p>
     <w:p>
       <w:pPr>
         <w:pStyle w:val="font-claude-response-body"/>
-        <w:rPr>
-          <w:rFonts w:asciiTheme="minorHAnsi" w:hAnsiTheme="minorHAnsi"/>
-          <w:sz w:val="22"/>
-          <w:szCs w:val="22"/>
-        </w:rPr>
-      </w:pPr>
-      <w:r>
-        <w:rPr>
-          <w:rFonts w:asciiTheme="minorHAnsi" w:hAnsiTheme="minorHAnsi"/>
-          <w:sz w:val="22"/>
-          <w:szCs w:val="22"/>
-        </w:rPr>
-        <w:t>Human wisdom is not captured in AI models. Wisdom emerges from lived experience, ethical judgment, and understanding consequences beyond what data can capture. Wisdom incorporates emotion, intuition, moral values, and the humility that comes from making mistakes and bearing their weight.</w:t>
+        <w:jc w:val="both"/>
+        <w:rPr>
+          <w:rFonts w:asciiTheme="minorHAnsi" w:hAnsiTheme="minorHAnsi"/>
+          <w:sz w:val="22"/>
+          <w:szCs w:val="22"/>
+        </w:rPr>
+      </w:pPr>
+      <w:r>
+        <w:rPr>
+          <w:rFonts w:asciiTheme="minorHAnsi" w:hAnsiTheme="minorHAnsi"/>
+          <w:sz w:val="22"/>
+          <w:szCs w:val="22"/>
+        </w:rPr>
+        <w:t>Human wisdom is not captured in AI models</w:t>
+      </w:r>
+      <w:r>
+        <w:rPr>
+          <w:rFonts w:asciiTheme="minorHAnsi" w:hAnsiTheme="minorHAnsi"/>
+          <w:sz w:val="22"/>
+          <w:szCs w:val="22"/>
+        </w:rPr>
+        <w:t xml:space="preserve">! </w:t>
+      </w:r>
+      <w:r>
+        <w:rPr>
+          <w:rFonts w:asciiTheme="minorHAnsi" w:hAnsiTheme="minorHAnsi"/>
+          <w:sz w:val="22"/>
+          <w:szCs w:val="22"/>
+        </w:rPr>
+        <w:t xml:space="preserve"> Wisdom emerges from lived experience, ethical judgment, and understanding consequences beyond what data can capture. Wisdom incorporates emotion, intuition, moral values, and the humility that comes from making mistakes and bearing their weight.</w:t>
       </w:r>
     </w:p>
     <w:p>
       <w:pPr>
         <w:pStyle w:val="font-claude-response-body"/>
-        <w:rPr>
-          <w:rFonts w:asciiTheme="minorHAnsi" w:hAnsiTheme="minorHAnsi"/>
-          <w:sz w:val="22"/>
-          <w:szCs w:val="22"/>
-        </w:rPr>
-      </w:pPr>
-      <w:r>
-        <w:rPr>
-          <w:rFonts w:asciiTheme="minorHAnsi" w:hAnsiTheme="minorHAnsi"/>
-          <w:sz w:val="22"/>
-          <w:szCs w:val="22"/>
-        </w:rPr>
-        <w:t xml:space="preserve">Paradoxically, AI may be essential for advancing human wisdom precisely because it handles what wisdom doesn't require. By processing vast amounts of data, identifying patterns, and managing complexity at scale, AI frees humans from information overload. This creates space for the reflective, experiential, and moral dimensions of wisdom to flourish. AI can show us what the data </w:t>
-      </w:r>
-      <w:proofErr w:type="gramStart"/>
-      <w:r>
-        <w:rPr>
-          <w:rFonts w:asciiTheme="minorHAnsi" w:hAnsiTheme="minorHAnsi"/>
-          <w:sz w:val="22"/>
-          <w:szCs w:val="22"/>
-        </w:rPr>
-        <w:t>says;</w:t>
-      </w:r>
-      <w:proofErr w:type="gramEnd"/>
-      <w:r>
-        <w:rPr>
-          <w:rFonts w:asciiTheme="minorHAnsi" w:hAnsiTheme="minorHAnsi"/>
-          <w:sz w:val="22"/>
-          <w:szCs w:val="22"/>
-        </w:rPr>
-        <w:t xml:space="preserve"> wisdom helps us decide what we should do about it. AI can reveal correlations; wisdom discerns meaning and purpose.</w:t>
+        <w:jc w:val="both"/>
+        <w:rPr>
+          <w:rFonts w:asciiTheme="minorHAnsi" w:hAnsiTheme="minorHAnsi"/>
+          <w:sz w:val="22"/>
+          <w:szCs w:val="22"/>
+        </w:rPr>
+      </w:pPr>
+      <w:r>
+        <w:rPr>
+          <w:rFonts w:asciiTheme="minorHAnsi" w:hAnsiTheme="minorHAnsi"/>
+          <w:sz w:val="22"/>
+          <w:szCs w:val="22"/>
+        </w:rPr>
+        <w:t xml:space="preserve">Paradoxically, AI may be essential for advancing human wisdom precisely because it handles what wisdom doesn't require. By processing vast amounts of data, identifying patterns, and managing complexity at scale, AI frees humans from information overload. This creates space for the reflective, experiential, and moral dimensions of wisdom to flourish. </w:t>
       </w:r>
     </w:p>
     <w:p>
       <w:pPr>
         <w:pStyle w:val="font-claude-response-body"/>
+        <w:jc w:val="both"/>
+        <w:rPr>
+          <w:rFonts w:asciiTheme="minorHAnsi" w:hAnsiTheme="minorHAnsi"/>
+          <w:sz w:val="22"/>
+          <w:szCs w:val="22"/>
+        </w:rPr>
+      </w:pPr>
+      <w:r>
+        <w:rPr>
+          <w:rFonts w:asciiTheme="minorHAnsi" w:hAnsiTheme="minorHAnsi"/>
+          <w:sz w:val="22"/>
+          <w:szCs w:val="22"/>
+        </w:rPr>
+        <w:lastRenderedPageBreak/>
+        <w:t xml:space="preserve">AI can show us what the data </w:t>
+      </w:r>
+      <w:proofErr w:type="gramStart"/>
+      <w:r>
+        <w:rPr>
+          <w:rFonts w:asciiTheme="minorHAnsi" w:hAnsiTheme="minorHAnsi"/>
+          <w:sz w:val="22"/>
+          <w:szCs w:val="22"/>
+        </w:rPr>
+        <w:t>says;</w:t>
+      </w:r>
+      <w:proofErr w:type="gramEnd"/>
+      <w:r>
+        <w:rPr>
+          <w:rFonts w:asciiTheme="minorHAnsi" w:hAnsiTheme="minorHAnsi"/>
+          <w:sz w:val="22"/>
+          <w:szCs w:val="22"/>
+        </w:rPr>
+        <w:t xml:space="preserve"> wisdom helps us decide what we should do about it. AI can reveal correlations; wisdom discerns meaning and purpose.</w:t>
+      </w:r>
+    </w:p>
+    <w:p>
+      <w:pPr>
+        <w:pStyle w:val="font-claude-response-body"/>
+        <w:jc w:val="both"/>
         <w:rPr>
           <w:rFonts w:asciiTheme="minorHAnsi" w:hAnsiTheme="minorHAnsi"/>
           <w:sz w:val="22"/>
@@ -296,27 +484,273 @@
           <w:sz w:val="22"/>
           <w:szCs w:val="22"/>
         </w:rPr>
-        <w:t xml:space="preserve">grown through struggle, relationships, and the accumulated </w:t>
-      </w:r>
-      <w:r>
-        <w:rPr>
-          <w:rFonts w:asciiTheme="minorHAnsi" w:hAnsiTheme="minorHAnsi"/>
-          <w:sz w:val="22"/>
-          <w:szCs w:val="22"/>
-        </w:rPr>
-        <w:lastRenderedPageBreak/>
-        <w:t>weight of choices that matter. In this partnership, AI makes us more capable, but wisdom makes us more human.</w:t>
-      </w:r>
-      <w:r>
-        <w:rPr>
-          <w:rFonts w:asciiTheme="minorHAnsi" w:hAnsiTheme="minorHAnsi"/>
-          <w:sz w:val="22"/>
-          <w:szCs w:val="22"/>
-        </w:rPr>
-        <w:t xml:space="preserve">  AI is the powerful bulldozer we need to build empires.</w:t>
+        <w:t>grown through struggle, relationships, and the accumulated weight of choices that matter. In this partnership, AI makes us more capable, but wisdom makes us more human.</w:t>
+      </w:r>
+      <w:r>
+        <w:rPr>
+          <w:rFonts w:asciiTheme="minorHAnsi" w:hAnsiTheme="minorHAnsi"/>
+          <w:sz w:val="22"/>
+          <w:szCs w:val="22"/>
+        </w:rPr>
+        <w:t xml:space="preserve">  AI is the powerful </w:t>
+      </w:r>
+      <w:r>
+        <w:rPr>
+          <w:rFonts w:asciiTheme="minorHAnsi" w:hAnsiTheme="minorHAnsi"/>
+          <w:sz w:val="22"/>
+          <w:szCs w:val="22"/>
+        </w:rPr>
+        <w:t>‘</w:t>
+      </w:r>
+      <w:r>
+        <w:rPr>
+          <w:rFonts w:asciiTheme="minorHAnsi" w:hAnsiTheme="minorHAnsi"/>
+          <w:sz w:val="22"/>
+          <w:szCs w:val="22"/>
+        </w:rPr>
+        <w:t>bulldozer</w:t>
+      </w:r>
+      <w:r>
+        <w:rPr>
+          <w:rFonts w:asciiTheme="minorHAnsi" w:hAnsiTheme="minorHAnsi"/>
+          <w:sz w:val="22"/>
+          <w:szCs w:val="22"/>
+        </w:rPr>
+        <w:t xml:space="preserve">’ </w:t>
+      </w:r>
+      <w:r>
+        <w:rPr>
+          <w:rFonts w:asciiTheme="minorHAnsi" w:hAnsiTheme="minorHAnsi"/>
+          <w:sz w:val="22"/>
+          <w:szCs w:val="22"/>
+        </w:rPr>
+        <w:t>we need to</w:t>
+      </w:r>
+      <w:r>
+        <w:rPr>
+          <w:rFonts w:asciiTheme="minorHAnsi" w:hAnsiTheme="minorHAnsi"/>
+          <w:sz w:val="22"/>
+          <w:szCs w:val="22"/>
+        </w:rPr>
+        <w:t xml:space="preserve"> move mountains and </w:t>
+      </w:r>
+      <w:r>
+        <w:rPr>
+          <w:rFonts w:asciiTheme="minorHAnsi" w:hAnsiTheme="minorHAnsi"/>
+          <w:sz w:val="22"/>
+          <w:szCs w:val="22"/>
+        </w:rPr>
+        <w:t>build empires.</w:t>
       </w:r>
     </w:p>
-    <w:p/>
+    <w:p>
+      <w:pPr>
+        <w:jc w:val="center"/>
+      </w:pPr>
+      <w:r>
+        <w:rPr>
+          <w:noProof/>
+        </w:rPr>
+        <w:drawing>
+          <wp:inline distT="0" distB="0" distL="0" distR="0" wp14:anchorId="136F6122" wp14:editId="5C50F9A9">
+            <wp:extent cx="2477668" cy="1351334"/>
+            <wp:effectExtent l="0" t="0" r="0" b="0"/>
+            <wp:docPr id="567927440" name="Picture 3" descr="A logo with blue lights&#10;&#10;AI-generated content may be incorrect."/>
+            <wp:cNvGraphicFramePr>
+              <a:graphicFrameLocks xmlns:a="http://schemas.openxmlformats.org/drawingml/2006/main" noChangeAspect="1"/>
+            </wp:cNvGraphicFramePr>
+            <a:graphic xmlns:a="http://schemas.openxmlformats.org/drawingml/2006/main">
+              <a:graphicData uri="http://schemas.openxmlformats.org/drawingml/2006/picture">
+                <pic:pic xmlns:pic="http://schemas.openxmlformats.org/drawingml/2006/picture">
+                  <pic:nvPicPr>
+                    <pic:cNvPr id="567927440" name="Picture 3" descr="A logo with blue lights&#10;&#10;AI-generated content may be incorrect."/>
+                    <pic:cNvPicPr/>
+                  </pic:nvPicPr>
+                  <pic:blipFill>
+                    <a:blip r:embed="rId5"/>
+                    <a:stretch>
+                      <a:fillRect/>
+                    </a:stretch>
+                  </pic:blipFill>
+                  <pic:spPr>
+                    <a:xfrm>
+                      <a:off x="0" y="0"/>
+                      <a:ext cx="2502197" cy="1364712"/>
+                    </a:xfrm>
+                    <a:prstGeom prst="rect">
+                      <a:avLst/>
+                    </a:prstGeom>
+                  </pic:spPr>
+                </pic:pic>
+              </a:graphicData>
+            </a:graphic>
+          </wp:inline>
+        </w:drawing>
+      </w:r>
+    </w:p>
+    <w:p>
+      <w:pPr>
+        <w:jc w:val="both"/>
+        <w:rPr>
+          <w:sz w:val="22"/>
+          <w:szCs w:val="22"/>
+        </w:rPr>
+      </w:pPr>
+      <w:r>
+        <w:rPr>
+          <w:sz w:val="22"/>
+          <w:szCs w:val="22"/>
+        </w:rPr>
+        <w:t>Knowledge Advantage</w:t>
+      </w:r>
+      <w:r>
+        <w:rPr>
+          <w:sz w:val="22"/>
+          <w:szCs w:val="22"/>
+        </w:rPr>
+        <w:t xml:space="preserve"> is a ‘Critical-Learning’ Platform - a Visual, Interactive, and Adaptive approach to supplementing human wisdom.  It’s currently being developed for educating patients, caregivers, and families to help them live with chronic diseases.   This Critical-Learning Platform leverages AI technology to personalize the learning experience.    This </w:t>
+      </w:r>
+      <w:proofErr w:type="gramStart"/>
+      <w:r>
+        <w:rPr>
+          <w:sz w:val="22"/>
+          <w:szCs w:val="22"/>
+        </w:rPr>
+        <w:t>experience</w:t>
+      </w:r>
+      <w:proofErr w:type="gramEnd"/>
+      <w:r>
+        <w:rPr>
+          <w:sz w:val="22"/>
+          <w:szCs w:val="22"/>
+        </w:rPr>
+        <w:t xml:space="preserve"> a Learning-graph for example this Interactive Learning Graph identifies the medications associated with dementia:</w:t>
+      </w:r>
+    </w:p>
+    <w:p>
+      <w:pPr>
+        <w:jc w:val="both"/>
+        <w:rPr>
+          <w:sz w:val="22"/>
+          <w:szCs w:val="22"/>
+        </w:rPr>
+      </w:pPr>
+    </w:p>
+    <w:p>
+      <w:pPr>
+        <w:jc w:val="center"/>
+        <w:rPr>
+          <w:sz w:val="22"/>
+          <w:szCs w:val="22"/>
+        </w:rPr>
+      </w:pPr>
+      <w:r>
+        <w:rPr>
+          <w:noProof/>
+          <w:sz w:val="22"/>
+          <w:szCs w:val="22"/>
+        </w:rPr>
+        <w:drawing>
+          <wp:inline distT="0" distB="0" distL="0" distR="0" wp14:anchorId="19ACBCD1" wp14:editId="51490ABE">
+            <wp:extent cx="3756660" cy="1902661"/>
+            <wp:effectExtent l="0" t="0" r="2540" b="2540"/>
+            <wp:docPr id="845600526" name="Picture 5" descr="A screenshot of a computer&#10;&#10;AI-generated content may be incorrect."/>
+            <wp:cNvGraphicFramePr>
+              <a:graphicFrameLocks xmlns:a="http://schemas.openxmlformats.org/drawingml/2006/main" noChangeAspect="1"/>
+            </wp:cNvGraphicFramePr>
+            <a:graphic xmlns:a="http://schemas.openxmlformats.org/drawingml/2006/main">
+              <a:graphicData uri="http://schemas.openxmlformats.org/drawingml/2006/picture">
+                <pic:pic xmlns:pic="http://schemas.openxmlformats.org/drawingml/2006/picture">
+                  <pic:nvPicPr>
+                    <pic:cNvPr id="845600526" name="Picture 5" descr="A screenshot of a computer&#10;&#10;AI-generated content may be incorrect."/>
+                    <pic:cNvPicPr/>
+                  </pic:nvPicPr>
+                  <pic:blipFill rotWithShape="1">
+                    <a:blip r:embed="rId6" cstate="print">
+                      <a:extLst>
+                        <a:ext uri="{28A0092B-C50C-407E-A947-70E740481C1C}">
+                          <a14:useLocalDpi xmlns:a14="http://schemas.microsoft.com/office/drawing/2010/main" val="0"/>
+                        </a:ext>
+                      </a:extLst>
+                    </a:blip>
+                    <a:srcRect t="1789"/>
+                    <a:stretch/>
+                  </pic:blipFill>
+                  <pic:spPr bwMode="auto">
+                    <a:xfrm>
+                      <a:off x="0" y="0"/>
+                      <a:ext cx="3812595" cy="1930991"/>
+                    </a:xfrm>
+                    <a:prstGeom prst="rect">
+                      <a:avLst/>
+                    </a:prstGeom>
+                    <a:ln>
+                      <a:noFill/>
+                    </a:ln>
+                    <a:extLst>
+                      <a:ext uri="{53640926-AAD7-44D8-BBD7-CCE9431645EC}">
+                        <a14:shadowObscured xmlns:a14="http://schemas.microsoft.com/office/drawing/2010/main"/>
+                      </a:ext>
+                    </a:extLst>
+                  </pic:spPr>
+                </pic:pic>
+              </a:graphicData>
+            </a:graphic>
+          </wp:inline>
+        </w:drawing>
+      </w:r>
+    </w:p>
+    <w:p>
+      <w:pPr>
+        <w:jc w:val="both"/>
+        <w:rPr>
+          <w:sz w:val="22"/>
+          <w:szCs w:val="22"/>
+        </w:rPr>
+      </w:pPr>
+    </w:p>
+    <w:p>
+      <w:pPr>
+        <w:jc w:val="both"/>
+        <w:rPr>
+          <w:sz w:val="22"/>
+          <w:szCs w:val="22"/>
+        </w:rPr>
+      </w:pPr>
+    </w:p>
+    <w:p>
+      <w:pPr>
+        <w:jc w:val="both"/>
+        <w:rPr>
+          <w:sz w:val="22"/>
+          <w:szCs w:val="22"/>
+        </w:rPr>
+      </w:pPr>
+    </w:p>
+    <w:p>
+      <w:pPr>
+        <w:rPr>
+          <w:sz w:val="22"/>
+          <w:szCs w:val="22"/>
+        </w:rPr>
+      </w:pPr>
+    </w:p>
+    <w:p>
+      <w:pPr>
+        <w:rPr>
+          <w:sz w:val="22"/>
+          <w:szCs w:val="22"/>
+        </w:rPr>
+      </w:pPr>
+    </w:p>
+    <w:p>
+      <w:pPr>
+        <w:rPr>
+          <w:sz w:val="22"/>
+          <w:szCs w:val="22"/>
+        </w:rPr>
+      </w:pPr>
+    </w:p>
     <w:p/>
     <w:p/>
     <w:sectPr>

</xml_diff>

<commit_message>
Deployed 2cb26dd5 with MkDocs version: 1.6.1
</commit_message>
<xml_diff>
--- a/AI is a Bulldozer .docx
+++ b/AI is a Bulldozer .docx
@@ -2,71 +2,7 @@
 <file path=word/document.xml><?xml version="1.0" encoding="utf-8"?>
 <w:document xmlns:wpc="http://schemas.microsoft.com/office/word/2010/wordprocessingCanvas" xmlns:cx="http://schemas.microsoft.com/office/drawing/2014/chartex" xmlns:cx1="http://schemas.microsoft.com/office/drawing/2015/9/8/chartex" xmlns:cx2="http://schemas.microsoft.com/office/drawing/2015/10/21/chartex" xmlns:cx3="http://schemas.microsoft.com/office/drawing/2016/5/9/chartex" xmlns:cx4="http://schemas.microsoft.com/office/drawing/2016/5/10/chartex" xmlns:cx5="http://schemas.microsoft.com/office/drawing/2016/5/11/chartex" xmlns:cx6="http://schemas.microsoft.com/office/drawing/2016/5/12/chartex" xmlns:cx7="http://schemas.microsoft.com/office/drawing/2016/5/13/chartex" xmlns:cx8="http://schemas.microsoft.com/office/drawing/2016/5/14/chartex" xmlns:mc="http://schemas.openxmlformats.org/markup-compatibility/2006" xmlns:aink="http://schemas.microsoft.com/office/drawing/2016/ink" xmlns:am3d="http://schemas.microsoft.com/office/drawing/2017/model3d" xmlns:o="urn:schemas-microsoft-com:office:office" xmlns:oel="http://schemas.microsoft.com/office/2019/extlst" xmlns:r="http://schemas.openxmlformats.org/officeDocument/2006/relationships" xmlns:m="http://schemas.openxmlformats.org/officeDocument/2006/math" xmlns:v="urn:schemas-microsoft-com:vml" xmlns:wp14="http://schemas.microsoft.com/office/word/2010/wordprocessingDrawing" xmlns:wp="http://schemas.openxmlformats.org/drawingml/2006/wordprocessingDrawing" xmlns:w10="urn:schemas-microsoft-com:office:word" xmlns:w="http://schemas.openxmlformats.org/wordprocessingml/2006/main" xmlns:w14="http://schemas.microsoft.com/office/word/2010/wordml" xmlns:w15="http://schemas.microsoft.com/office/word/2012/wordml" xmlns:w16cex="http://schemas.microsoft.com/office/word/2018/wordml/cex" xmlns:w16cid="http://schemas.microsoft.com/office/word/2016/wordml/cid" xmlns:w16="http://schemas.microsoft.com/office/word/2018/wordml" xmlns:w16du="http://schemas.microsoft.com/office/word/2023/wordml/word16du" xmlns:w16sdtdh="http://schemas.microsoft.com/office/word/2020/wordml/sdtdatahash" xmlns:w16sdtfl="http://schemas.microsoft.com/office/word/2024/wordml/sdtformatlock" xmlns:w16se="http://schemas.microsoft.com/office/word/2015/wordml/symex" xmlns:wpg="http://schemas.microsoft.com/office/word/2010/wordprocessingGroup" xmlns:wpi="http://schemas.microsoft.com/office/word/2010/wordprocessingInk" xmlns:wne="http://schemas.microsoft.com/office/word/2006/wordml" xmlns:wps="http://schemas.microsoft.com/office/word/2010/wordprocessingShape" mc:Ignorable="w14 w15 w16se w16cid w16 w16cex w16sdtdh w16sdtfl w16du wp14">
   <w:body>
-    <w:p>
-      <w:pPr>
-        <w:rPr>
-          <w:rFonts w:ascii="Times New Roman" w:hAnsi="Times New Roman" w:cs="Times New Roman"/>
-          <w:i/>
-          <w:iCs/>
-          <w:sz w:val="22"/>
-          <w:szCs w:val="22"/>
-        </w:rPr>
-      </w:pPr>
-      <w:r>
-        <w:rPr>
-          <w:rFonts w:ascii="Times New Roman" w:hAnsi="Times New Roman" w:cs="Times New Roman"/>
-          <w:i/>
-          <w:iCs/>
-          <w:sz w:val="22"/>
-          <w:szCs w:val="22"/>
-        </w:rPr>
-        <w:t xml:space="preserve"> Technology is often reduced to initials, like IT, AI and LLM; metaphors: Data Warehouses, Data Lakes, the Cloud, etc.; and occasionally oxymorons, notably Artificial Intelligence.  ‘Artificial Intelligence’ suggests that AI is fake and therefore untrustworthy.  I offer another </w:t>
-      </w:r>
-      <w:proofErr w:type="gramStart"/>
-      <w:r>
-        <w:rPr>
-          <w:rFonts w:ascii="Times New Roman" w:hAnsi="Times New Roman" w:cs="Times New Roman"/>
-          <w:i/>
-          <w:iCs/>
-          <w:sz w:val="22"/>
-          <w:szCs w:val="22"/>
-        </w:rPr>
-        <w:t>Metaphor,  ‘</w:t>
-      </w:r>
-      <w:proofErr w:type="gramEnd"/>
-      <w:r>
-        <w:rPr>
-          <w:rFonts w:ascii="Times New Roman" w:hAnsi="Times New Roman" w:cs="Times New Roman"/>
-          <w:i/>
-          <w:iCs/>
-          <w:sz w:val="22"/>
-          <w:szCs w:val="22"/>
-        </w:rPr>
-        <w:t xml:space="preserve">Data Bulldozer’ to describe a powerful </w:t>
-      </w:r>
-      <w:proofErr w:type="gramStart"/>
-      <w:r>
-        <w:rPr>
-          <w:rFonts w:ascii="Times New Roman" w:hAnsi="Times New Roman" w:cs="Times New Roman"/>
-          <w:i/>
-          <w:iCs/>
-          <w:sz w:val="22"/>
-          <w:szCs w:val="22"/>
-        </w:rPr>
-        <w:t>technology .</w:t>
-      </w:r>
-      <w:proofErr w:type="gramEnd"/>
-      <w:r>
-        <w:rPr>
-          <w:rFonts w:ascii="Times New Roman" w:hAnsi="Times New Roman" w:cs="Times New Roman"/>
-          <w:i/>
-          <w:iCs/>
-          <w:sz w:val="22"/>
-          <w:szCs w:val="22"/>
-        </w:rPr>
-        <w:t xml:space="preserve">   </w:t>
-      </w:r>
-    </w:p>
+    <w:p/>
     <w:p>
       <w:pPr>
         <w:jc w:val="center"/>
@@ -77,17 +13,15 @@
           <w:szCs w:val="36"/>
         </w:rPr>
       </w:pPr>
-    </w:p>
-    <w:p>
-      <w:pPr>
-        <w:jc w:val="center"/>
+      <w:r>
         <w:rPr>
           <w:b/>
           <w:bCs/>
           <w:sz w:val="36"/>
           <w:szCs w:val="36"/>
         </w:rPr>
-      </w:pPr>
+        <w:t xml:space="preserve">AI is </w:t>
+      </w:r>
       <w:r>
         <w:rPr>
           <w:b/>
@@ -95,7 +29,7 @@
           <w:sz w:val="36"/>
           <w:szCs w:val="36"/>
         </w:rPr>
-        <w:t xml:space="preserve">AI is </w:t>
+        <w:t xml:space="preserve">a </w:t>
       </w:r>
       <w:r>
         <w:rPr>
@@ -104,34 +38,7 @@
           <w:sz w:val="36"/>
           <w:szCs w:val="36"/>
         </w:rPr>
-        <w:t xml:space="preserve">a </w:t>
-      </w:r>
-      <w:r>
-        <w:rPr>
-          <w:b/>
-          <w:bCs/>
-          <w:sz w:val="36"/>
-          <w:szCs w:val="36"/>
-        </w:rPr>
-        <w:t>Bulldozer for Moving</w:t>
-      </w:r>
-      <w:r>
-        <w:rPr>
-          <w:b/>
-          <w:bCs/>
-          <w:sz w:val="36"/>
-          <w:szCs w:val="36"/>
-        </w:rPr>
-        <w:t xml:space="preserve"> Mountains of </w:t>
-      </w:r>
-      <w:r>
-        <w:rPr>
-          <w:b/>
-          <w:bCs/>
-          <w:sz w:val="36"/>
-          <w:szCs w:val="36"/>
-        </w:rPr>
-        <w:t>Data</w:t>
+        <w:t>Bulldozer for Moving Data</w:t>
       </w:r>
     </w:p>
     <w:p>
@@ -230,62 +137,40 @@
           <w:sz w:val="28"/>
           <w:szCs w:val="28"/>
         </w:rPr>
-        <w:t>Human</w:t>
+        <w:t>Human Wisdom</w:t>
       </w:r>
       <w:r>
         <w:rPr>
           <w:sz w:val="28"/>
           <w:szCs w:val="28"/>
         </w:rPr>
-        <w:t xml:space="preserve"> Wisdom</w:t>
+        <w:t xml:space="preserve"> </w:t>
       </w:r>
       <w:r>
         <w:rPr>
           <w:sz w:val="28"/>
           <w:szCs w:val="28"/>
         </w:rPr>
-        <w:t xml:space="preserve"> </w:t>
+        <w:t xml:space="preserve">to </w:t>
       </w:r>
       <w:r>
         <w:rPr>
           <w:sz w:val="28"/>
           <w:szCs w:val="28"/>
         </w:rPr>
-        <w:t xml:space="preserve">to </w:t>
+        <w:t>F</w:t>
       </w:r>
       <w:r>
         <w:rPr>
           <w:sz w:val="28"/>
           <w:szCs w:val="28"/>
         </w:rPr>
-        <w:t>F</w:t>
-      </w:r>
-      <w:r>
-        <w:rPr>
-          <w:sz w:val="28"/>
-          <w:szCs w:val="28"/>
-        </w:rPr>
-        <w:t>lourish</w:t>
-      </w:r>
-      <w:r>
-        <w:rPr>
-          <w:sz w:val="28"/>
-          <w:szCs w:val="28"/>
-        </w:rPr>
-        <w:t>.</w:t>
-      </w:r>
-      <w:r>
-        <w:rPr>
-          <w:sz w:val="28"/>
-          <w:szCs w:val="28"/>
-        </w:rPr>
-        <w:t xml:space="preserve"> </w:t>
+        <w:t xml:space="preserve">lourish </w:t>
       </w:r>
     </w:p>
     <w:p>
       <w:pPr>
         <w:pStyle w:val="font-claude-response-body"/>
-        <w:jc w:val="both"/>
         <w:rPr>
           <w:rFonts w:asciiTheme="minorHAnsi" w:hAnsiTheme="minorHAnsi"/>
           <w:sz w:val="22"/>
@@ -314,47 +199,12 @@
           <w:sz w:val="22"/>
           <w:szCs w:val="22"/>
         </w:rPr>
-        <w:t>in these moments we rely on</w:t>
-      </w:r>
-      <w:r>
-        <w:rPr>
-          <w:rFonts w:asciiTheme="minorHAnsi" w:hAnsiTheme="minorHAnsi"/>
-          <w:sz w:val="22"/>
-          <w:szCs w:val="22"/>
-        </w:rPr>
-        <w:t xml:space="preserve"> </w:t>
-      </w:r>
-      <w:proofErr w:type="gramStart"/>
-      <w:r>
-        <w:rPr>
-          <w:rFonts w:asciiTheme="minorHAnsi" w:hAnsiTheme="minorHAnsi"/>
-          <w:sz w:val="22"/>
-          <w:szCs w:val="22"/>
-        </w:rPr>
-        <w:t xml:space="preserve">personal </w:t>
-      </w:r>
-      <w:r>
-        <w:rPr>
-          <w:rFonts w:asciiTheme="minorHAnsi" w:hAnsiTheme="minorHAnsi"/>
-          <w:sz w:val="22"/>
-          <w:szCs w:val="22"/>
-        </w:rPr>
-        <w:t xml:space="preserve"> wisdom</w:t>
-      </w:r>
-      <w:proofErr w:type="gramEnd"/>
-      <w:r>
-        <w:rPr>
-          <w:rFonts w:asciiTheme="minorHAnsi" w:hAnsiTheme="minorHAnsi"/>
-          <w:sz w:val="22"/>
-          <w:szCs w:val="22"/>
-        </w:rPr>
-        <w:t xml:space="preserve"> to make decisions.</w:t>
+        <w:t>in these moments we must rely on wisdom to make decisions.</w:t>
       </w:r>
     </w:p>
     <w:p>
       <w:pPr>
         <w:pStyle w:val="font-claude-response-body"/>
-        <w:jc w:val="both"/>
         <w:rPr>
           <w:rFonts w:asciiTheme="minorHAnsi" w:hAnsiTheme="minorHAnsi"/>
           <w:sz w:val="22"/>
@@ -367,29 +217,12 @@
           <w:sz w:val="22"/>
           <w:szCs w:val="22"/>
         </w:rPr>
-        <w:t>Human wisdom is not captured in AI models</w:t>
-      </w:r>
-      <w:r>
-        <w:rPr>
-          <w:rFonts w:asciiTheme="minorHAnsi" w:hAnsiTheme="minorHAnsi"/>
-          <w:sz w:val="22"/>
-          <w:szCs w:val="22"/>
-        </w:rPr>
-        <w:t xml:space="preserve">! </w:t>
-      </w:r>
-      <w:r>
-        <w:rPr>
-          <w:rFonts w:asciiTheme="minorHAnsi" w:hAnsiTheme="minorHAnsi"/>
-          <w:sz w:val="22"/>
-          <w:szCs w:val="22"/>
-        </w:rPr>
-        <w:t xml:space="preserve"> Wisdom emerges from lived experience, ethical judgment, and understanding consequences beyond what data can capture. Wisdom incorporates emotion, intuition, moral values, and the humility that comes from making mistakes and bearing their weight.</w:t>
+        <w:t>Human wisdom is not captured in AI models. Wisdom emerges from lived experience, ethical judgment, and understanding consequences beyond what data can capture. Wisdom incorporates emotion, intuition, moral values, and the humility that comes from making mistakes and bearing their weight.</w:t>
       </w:r>
     </w:p>
     <w:p>
       <w:pPr>
         <w:pStyle w:val="font-claude-response-body"/>
-        <w:jc w:val="both"/>
         <w:rPr>
           <w:rFonts w:asciiTheme="minorHAnsi" w:hAnsiTheme="minorHAnsi"/>
           <w:sz w:val="22"/>
@@ -402,51 +235,30 @@
           <w:sz w:val="22"/>
           <w:szCs w:val="22"/>
         </w:rPr>
-        <w:t xml:space="preserve">Paradoxically, AI may be essential for advancing human wisdom precisely because it handles what wisdom doesn't require. By processing vast amounts of data, identifying patterns, and managing complexity at scale, AI frees humans from information overload. This creates space for the reflective, experiential, and moral dimensions of wisdom to flourish. </w:t>
+        <w:t xml:space="preserve">Paradoxically, AI may be essential for advancing human wisdom precisely because it handles what wisdom doesn't require. By processing vast amounts of data, identifying patterns, and managing complexity at scale, AI frees humans from information overload. This creates space for the reflective, experiential, and moral dimensions of wisdom to flourish. AI can show us what the data </w:t>
+      </w:r>
+      <w:proofErr w:type="gramStart"/>
+      <w:r>
+        <w:rPr>
+          <w:rFonts w:asciiTheme="minorHAnsi" w:hAnsiTheme="minorHAnsi"/>
+          <w:sz w:val="22"/>
+          <w:szCs w:val="22"/>
+        </w:rPr>
+        <w:t>says;</w:t>
+      </w:r>
+      <w:proofErr w:type="gramEnd"/>
+      <w:r>
+        <w:rPr>
+          <w:rFonts w:asciiTheme="minorHAnsi" w:hAnsiTheme="minorHAnsi"/>
+          <w:sz w:val="22"/>
+          <w:szCs w:val="22"/>
+        </w:rPr>
+        <w:t xml:space="preserve"> wisdom helps us decide what we should do about it. AI can reveal correlations; wisdom discerns meaning and purpose.</w:t>
       </w:r>
     </w:p>
     <w:p>
       <w:pPr>
         <w:pStyle w:val="font-claude-response-body"/>
-        <w:jc w:val="both"/>
-        <w:rPr>
-          <w:rFonts w:asciiTheme="minorHAnsi" w:hAnsiTheme="minorHAnsi"/>
-          <w:sz w:val="22"/>
-          <w:szCs w:val="22"/>
-        </w:rPr>
-      </w:pPr>
-      <w:r>
-        <w:rPr>
-          <w:rFonts w:asciiTheme="minorHAnsi" w:hAnsiTheme="minorHAnsi"/>
-          <w:sz w:val="22"/>
-          <w:szCs w:val="22"/>
-        </w:rPr>
-        <w:lastRenderedPageBreak/>
-        <w:t xml:space="preserve">AI can show us what the data </w:t>
-      </w:r>
-      <w:proofErr w:type="gramStart"/>
-      <w:r>
-        <w:rPr>
-          <w:rFonts w:asciiTheme="minorHAnsi" w:hAnsiTheme="minorHAnsi"/>
-          <w:sz w:val="22"/>
-          <w:szCs w:val="22"/>
-        </w:rPr>
-        <w:t>says;</w:t>
-      </w:r>
-      <w:proofErr w:type="gramEnd"/>
-      <w:r>
-        <w:rPr>
-          <w:rFonts w:asciiTheme="minorHAnsi" w:hAnsiTheme="minorHAnsi"/>
-          <w:sz w:val="22"/>
-          <w:szCs w:val="22"/>
-        </w:rPr>
-        <w:t xml:space="preserve"> wisdom helps us decide what we should do about it. AI can reveal correlations; wisdom discerns meaning and purpose.</w:t>
-      </w:r>
-    </w:p>
-    <w:p>
-      <w:pPr>
-        <w:pStyle w:val="font-claude-response-body"/>
-        <w:jc w:val="both"/>
         <w:rPr>
           <w:rFonts w:asciiTheme="minorHAnsi" w:hAnsiTheme="minorHAnsi"/>
           <w:sz w:val="22"/>
@@ -484,273 +296,27 @@
           <w:sz w:val="22"/>
           <w:szCs w:val="22"/>
         </w:rPr>
-        <w:t>grown through struggle, relationships, and the accumulated weight of choices that matter. In this partnership, AI makes us more capable, but wisdom makes us more human.</w:t>
-      </w:r>
-      <w:r>
-        <w:rPr>
-          <w:rFonts w:asciiTheme="minorHAnsi" w:hAnsiTheme="minorHAnsi"/>
-          <w:sz w:val="22"/>
-          <w:szCs w:val="22"/>
-        </w:rPr>
-        <w:t xml:space="preserve">  AI is the powerful </w:t>
-      </w:r>
-      <w:r>
-        <w:rPr>
-          <w:rFonts w:asciiTheme="minorHAnsi" w:hAnsiTheme="minorHAnsi"/>
-          <w:sz w:val="22"/>
-          <w:szCs w:val="22"/>
-        </w:rPr>
-        <w:t>‘</w:t>
-      </w:r>
-      <w:r>
-        <w:rPr>
-          <w:rFonts w:asciiTheme="minorHAnsi" w:hAnsiTheme="minorHAnsi"/>
-          <w:sz w:val="22"/>
-          <w:szCs w:val="22"/>
-        </w:rPr>
-        <w:t>bulldozer</w:t>
-      </w:r>
-      <w:r>
-        <w:rPr>
-          <w:rFonts w:asciiTheme="minorHAnsi" w:hAnsiTheme="minorHAnsi"/>
-          <w:sz w:val="22"/>
-          <w:szCs w:val="22"/>
-        </w:rPr>
-        <w:t xml:space="preserve">’ </w:t>
-      </w:r>
-      <w:r>
-        <w:rPr>
-          <w:rFonts w:asciiTheme="minorHAnsi" w:hAnsiTheme="minorHAnsi"/>
-          <w:sz w:val="22"/>
-          <w:szCs w:val="22"/>
-        </w:rPr>
-        <w:t>we need to</w:t>
-      </w:r>
-      <w:r>
-        <w:rPr>
-          <w:rFonts w:asciiTheme="minorHAnsi" w:hAnsiTheme="minorHAnsi"/>
-          <w:sz w:val="22"/>
-          <w:szCs w:val="22"/>
-        </w:rPr>
-        <w:t xml:space="preserve"> move mountains and </w:t>
-      </w:r>
-      <w:r>
-        <w:rPr>
-          <w:rFonts w:asciiTheme="minorHAnsi" w:hAnsiTheme="minorHAnsi"/>
-          <w:sz w:val="22"/>
-          <w:szCs w:val="22"/>
-        </w:rPr>
-        <w:t>build empires.</w:t>
+        <w:t xml:space="preserve">grown through struggle, relationships, and the accumulated </w:t>
+      </w:r>
+      <w:r>
+        <w:rPr>
+          <w:rFonts w:asciiTheme="minorHAnsi" w:hAnsiTheme="minorHAnsi"/>
+          <w:sz w:val="22"/>
+          <w:szCs w:val="22"/>
+        </w:rPr>
+        <w:lastRenderedPageBreak/>
+        <w:t>weight of choices that matter. In this partnership, AI makes us more capable, but wisdom makes us more human.</w:t>
+      </w:r>
+      <w:r>
+        <w:rPr>
+          <w:rFonts w:asciiTheme="minorHAnsi" w:hAnsiTheme="minorHAnsi"/>
+          <w:sz w:val="22"/>
+          <w:szCs w:val="22"/>
+        </w:rPr>
+        <w:t xml:space="preserve">  AI is the powerful bulldozer we need to build empires.</w:t>
       </w:r>
     </w:p>
-    <w:p>
-      <w:pPr>
-        <w:jc w:val="center"/>
-      </w:pPr>
-      <w:r>
-        <w:rPr>
-          <w:noProof/>
-        </w:rPr>
-        <w:drawing>
-          <wp:inline distT="0" distB="0" distL="0" distR="0" wp14:anchorId="136F6122" wp14:editId="5C50F9A9">
-            <wp:extent cx="2477668" cy="1351334"/>
-            <wp:effectExtent l="0" t="0" r="0" b="0"/>
-            <wp:docPr id="567927440" name="Picture 3" descr="A logo with blue lights&#10;&#10;AI-generated content may be incorrect."/>
-            <wp:cNvGraphicFramePr>
-              <a:graphicFrameLocks xmlns:a="http://schemas.openxmlformats.org/drawingml/2006/main" noChangeAspect="1"/>
-            </wp:cNvGraphicFramePr>
-            <a:graphic xmlns:a="http://schemas.openxmlformats.org/drawingml/2006/main">
-              <a:graphicData uri="http://schemas.openxmlformats.org/drawingml/2006/picture">
-                <pic:pic xmlns:pic="http://schemas.openxmlformats.org/drawingml/2006/picture">
-                  <pic:nvPicPr>
-                    <pic:cNvPr id="567927440" name="Picture 3" descr="A logo with blue lights&#10;&#10;AI-generated content may be incorrect."/>
-                    <pic:cNvPicPr/>
-                  </pic:nvPicPr>
-                  <pic:blipFill>
-                    <a:blip r:embed="rId5"/>
-                    <a:stretch>
-                      <a:fillRect/>
-                    </a:stretch>
-                  </pic:blipFill>
-                  <pic:spPr>
-                    <a:xfrm>
-                      <a:off x="0" y="0"/>
-                      <a:ext cx="2502197" cy="1364712"/>
-                    </a:xfrm>
-                    <a:prstGeom prst="rect">
-                      <a:avLst/>
-                    </a:prstGeom>
-                  </pic:spPr>
-                </pic:pic>
-              </a:graphicData>
-            </a:graphic>
-          </wp:inline>
-        </w:drawing>
-      </w:r>
-    </w:p>
-    <w:p>
-      <w:pPr>
-        <w:jc w:val="both"/>
-        <w:rPr>
-          <w:sz w:val="22"/>
-          <w:szCs w:val="22"/>
-        </w:rPr>
-      </w:pPr>
-      <w:r>
-        <w:rPr>
-          <w:sz w:val="22"/>
-          <w:szCs w:val="22"/>
-        </w:rPr>
-        <w:t>Knowledge Advantage</w:t>
-      </w:r>
-      <w:r>
-        <w:rPr>
-          <w:sz w:val="22"/>
-          <w:szCs w:val="22"/>
-        </w:rPr>
-        <w:t xml:space="preserve"> is a ‘Critical-Learning’ Platform - a Visual, Interactive, and Adaptive approach to supplementing human wisdom.  It’s currently being developed for educating patients, caregivers, and families to help them live with chronic diseases.   This Critical-Learning Platform leverages AI technology to personalize the learning experience.    This </w:t>
-      </w:r>
-      <w:proofErr w:type="gramStart"/>
-      <w:r>
-        <w:rPr>
-          <w:sz w:val="22"/>
-          <w:szCs w:val="22"/>
-        </w:rPr>
-        <w:t>experience</w:t>
-      </w:r>
-      <w:proofErr w:type="gramEnd"/>
-      <w:r>
-        <w:rPr>
-          <w:sz w:val="22"/>
-          <w:szCs w:val="22"/>
-        </w:rPr>
-        <w:t xml:space="preserve"> a Learning-graph for example this Interactive Learning Graph identifies the medications associated with dementia:</w:t>
-      </w:r>
-    </w:p>
-    <w:p>
-      <w:pPr>
-        <w:jc w:val="both"/>
-        <w:rPr>
-          <w:sz w:val="22"/>
-          <w:szCs w:val="22"/>
-        </w:rPr>
-      </w:pPr>
-    </w:p>
-    <w:p>
-      <w:pPr>
-        <w:jc w:val="center"/>
-        <w:rPr>
-          <w:sz w:val="22"/>
-          <w:szCs w:val="22"/>
-        </w:rPr>
-      </w:pPr>
-      <w:r>
-        <w:rPr>
-          <w:noProof/>
-          <w:sz w:val="22"/>
-          <w:szCs w:val="22"/>
-        </w:rPr>
-        <w:drawing>
-          <wp:inline distT="0" distB="0" distL="0" distR="0" wp14:anchorId="19ACBCD1" wp14:editId="51490ABE">
-            <wp:extent cx="3756660" cy="1902661"/>
-            <wp:effectExtent l="0" t="0" r="2540" b="2540"/>
-            <wp:docPr id="845600526" name="Picture 5" descr="A screenshot of a computer&#10;&#10;AI-generated content may be incorrect."/>
-            <wp:cNvGraphicFramePr>
-              <a:graphicFrameLocks xmlns:a="http://schemas.openxmlformats.org/drawingml/2006/main" noChangeAspect="1"/>
-            </wp:cNvGraphicFramePr>
-            <a:graphic xmlns:a="http://schemas.openxmlformats.org/drawingml/2006/main">
-              <a:graphicData uri="http://schemas.openxmlformats.org/drawingml/2006/picture">
-                <pic:pic xmlns:pic="http://schemas.openxmlformats.org/drawingml/2006/picture">
-                  <pic:nvPicPr>
-                    <pic:cNvPr id="845600526" name="Picture 5" descr="A screenshot of a computer&#10;&#10;AI-generated content may be incorrect."/>
-                    <pic:cNvPicPr/>
-                  </pic:nvPicPr>
-                  <pic:blipFill rotWithShape="1">
-                    <a:blip r:embed="rId6" cstate="print">
-                      <a:extLst>
-                        <a:ext uri="{28A0092B-C50C-407E-A947-70E740481C1C}">
-                          <a14:useLocalDpi xmlns:a14="http://schemas.microsoft.com/office/drawing/2010/main" val="0"/>
-                        </a:ext>
-                      </a:extLst>
-                    </a:blip>
-                    <a:srcRect t="1789"/>
-                    <a:stretch/>
-                  </pic:blipFill>
-                  <pic:spPr bwMode="auto">
-                    <a:xfrm>
-                      <a:off x="0" y="0"/>
-                      <a:ext cx="3812595" cy="1930991"/>
-                    </a:xfrm>
-                    <a:prstGeom prst="rect">
-                      <a:avLst/>
-                    </a:prstGeom>
-                    <a:ln>
-                      <a:noFill/>
-                    </a:ln>
-                    <a:extLst>
-                      <a:ext uri="{53640926-AAD7-44D8-BBD7-CCE9431645EC}">
-                        <a14:shadowObscured xmlns:a14="http://schemas.microsoft.com/office/drawing/2010/main"/>
-                      </a:ext>
-                    </a:extLst>
-                  </pic:spPr>
-                </pic:pic>
-              </a:graphicData>
-            </a:graphic>
-          </wp:inline>
-        </w:drawing>
-      </w:r>
-    </w:p>
-    <w:p>
-      <w:pPr>
-        <w:jc w:val="both"/>
-        <w:rPr>
-          <w:sz w:val="22"/>
-          <w:szCs w:val="22"/>
-        </w:rPr>
-      </w:pPr>
-    </w:p>
-    <w:p>
-      <w:pPr>
-        <w:jc w:val="both"/>
-        <w:rPr>
-          <w:sz w:val="22"/>
-          <w:szCs w:val="22"/>
-        </w:rPr>
-      </w:pPr>
-    </w:p>
-    <w:p>
-      <w:pPr>
-        <w:jc w:val="both"/>
-        <w:rPr>
-          <w:sz w:val="22"/>
-          <w:szCs w:val="22"/>
-        </w:rPr>
-      </w:pPr>
-    </w:p>
-    <w:p>
-      <w:pPr>
-        <w:rPr>
-          <w:sz w:val="22"/>
-          <w:szCs w:val="22"/>
-        </w:rPr>
-      </w:pPr>
-    </w:p>
-    <w:p>
-      <w:pPr>
-        <w:rPr>
-          <w:sz w:val="22"/>
-          <w:szCs w:val="22"/>
-        </w:rPr>
-      </w:pPr>
-    </w:p>
-    <w:p>
-      <w:pPr>
-        <w:rPr>
-          <w:sz w:val="22"/>
-          <w:szCs w:val="22"/>
-        </w:rPr>
-      </w:pPr>
-    </w:p>
+    <w:p/>
     <w:p/>
     <w:p/>
     <w:sectPr>

</xml_diff>